<commit_message>
Complete front-to-back revision pass per Jeff's July 23 direction
- Introduction: verified highway fix, added Bonus Pack expectation paragraph
- Title page corrected to decided title/subtitle (was still Airbnb Anywhere)
- Chapter 1: five-year scoreboard running-tally table + end-of-chapter action
- Chapter 10: full queen-over-queen bunk hack with Columbus GA ceiling story
- Consistency sweep: retired last "bindable quote" jargon (Ch8), genericized
  BatchLeads/PropStream and AirDNA/Rabbu leftovers (Ch7/Ch9), fixed stray
  PriceLabs mention (Ch16), reconciled setup-cost range (Ch9)
- Rule #1 audit clean: no retired claims, tool names only in allowed spots,
  no banned filler, 145 em-dashes across 64.6K words
- Added REVISION-LOG.md + docx: plain-English chapter-by-chapter change record
- revision-tasks.md: all 20 tasks marked complete

Co-Authored-By: Claude Fable 5 <noreply@anthropic.com>
Claude-Session: https://claude.ai/code/session_015nzsXVPus1uW1psxXwQoWk
</commit_message>
<xml_diff>
--- a/book/Vacation Rentals That Pay You - REVISED DRAFT.docx
+++ b/book/Vacation Rentals That Pay You - REVISED DRAFT.docx
@@ -2,13 +2,47 @@
 <file path=word/document.xml><?xml version="1.0" encoding="utf-8"?>
 <w:document xmlns:w="http://schemas.openxmlformats.org/wordprocessingml/2006/main" xmlns:m="http://schemas.openxmlformats.org/officeDocument/2006/math" xmlns:r="http://schemas.openxmlformats.org/officeDocument/2006/relationships" xmlns:o="urn:schemas-microsoft-com:office:office" xmlns:v="urn:schemas-microsoft-com:vml" xmlns:w10="urn:schemas-microsoft-com:office:word" xmlns:a="http://schemas.openxmlformats.org/drawingml/2006/main" xmlns:pic="http://schemas.openxmlformats.org/drawingml/2006/picture" xmlns:wp="http://schemas.openxmlformats.org/drawingml/2006/wordprocessingDrawing">
   <w:body>
-    <w:bookmarkStart w:id="25" w:name="airbnb-anywhere"/>
+    <w:p>
+      <w:pPr>
+        <w:pStyle w:val="Title"/>
+      </w:pPr>
+      <w:r>
+        <w:t xml:space="preserve">Vacation Rentals That Pay You ��� REVISED DRAFT (July 23, 2026)</w:t>
+      </w:r>
+    </w:p>
+    <w:sdt>
+      <w:sdtPr>
+        <w:docPartObj>
+          <w:docPartGallery w:val="Table of Contents"/>
+          <w:docPartUnique/>
+        </w:docPartObj>
+      </w:sdtPr>
+      <w:sdtContent>
+        <w:p>
+          <w:pPr>
+            <w:pStyle w:val="TOCHeading"/>
+          </w:pPr>
+          <w:r>
+            <w:t xml:space="preserve">Table of Contents</w:t>
+          </w:r>
+        </w:p>
+        <w:p>
+          <w:r>
+            <w:fldChar w:fldCharType="begin" w:dirty="true"/>
+            <w:instrText xml:space="preserve">TOC \o "1-2" \h \z \u</w:instrText>
+            <w:fldChar w:fldCharType="separate"/>
+            <w:fldChar w:fldCharType="end"/>
+          </w:r>
+        </w:p>
+      </w:sdtContent>
+    </w:sdt>
+    <w:bookmarkStart w:id="25" w:name="vacation-rentals-that-pay-you"/>
     <w:p>
       <w:pPr>
         <w:pStyle w:val="Heading1"/>
       </w:pPr>
       <w:r>
-        <w:t xml:space="preserve">Airbnb Anywhere</w:t>
+        <w:t xml:space="preserve">Vacation Rentals That Pay You</w:t>
       </w:r>
     </w:p>
     <w:p>
@@ -20,7 +54,7 @@
           <w:bCs/>
           <w:b/>
         </w:rPr>
-        <w:t xml:space="preserve">The 5-Step RURAL Method for Buying Vacation Rentals That Pay You — From Towns You’ve Never Visited</w:t>
+        <w:t xml:space="preserve">The 5-Step RURAL Method for Building Cash Flow From Small Towns You’ve Never Visited</w:t>
       </w:r>
     </w:p>
     <w:p>
@@ -852,6 +886,14 @@
       </w:pPr>
       <w:r>
         <w:t xml:space="preserve">Read it straight through the first time. After that, use it like a field manual; each part stands on its own when you’re mid-deal and need the checklist.</w:t>
+      </w:r>
+    </w:p>
+    <w:p>
+      <w:pPr>
+        <w:pStyle w:val="BodyText"/>
+      </w:pPr>
+      <w:r>
+        <w:t xml:space="preserve">I’ve also kept this book deliberately lean. The deep worksheets, calculators, checklists, and step-by-step SOPs live in the free Bonus Pack at the back of this book, so the chapters stay readable and the depth is there the day you need it. When a chapter points you to the Bonus Pack, that’s where to go.</w:t>
       </w:r>
     </w:p>
     <w:p>
@@ -1907,6 +1949,24 @@
         <w:t xml:space="preserve">The next chapter shows you where this strategy works best, and I’ll warn you now that it’s probably nowhere near you.</w:t>
       </w:r>
     </w:p>
+    <w:p>
+      <w:pPr>
+        <w:pStyle w:val="BodyText"/>
+      </w:pPr>
+      <w:r>
+        <w:rPr>
+          <w:bCs/>
+          <w:b/>
+        </w:rPr>
+        <w:t xml:space="preserve">Before the next chapter, do one thing.</w:t>
+      </w:r>
+      <w:r>
+        <w:t xml:space="preserve"> </w:t>
+      </w:r>
+      <w:r>
+        <w:t xml:space="preserve">Run your own five-year math, honestly, on one sheet of paper: your salary times five, minus taxes, minus what your lifestyle actually spends. Look at the number you’d keep. That number is the case for everything that follows.</w:t>
+      </w:r>
+    </w:p>
     <w:bookmarkEnd w:id="29"/>
     <w:bookmarkStart w:id="30" w:name="chapter-summary"/>
     <w:p>
@@ -11761,7 +11821,7 @@
         <w:t xml:space="preserve"> </w:t>
       </w:r>
       <w:r>
-        <w:t xml:space="preserve">Budget for a short-term-rental policy, not a homeowners policy. A homeowners policy typically voids your coverage the moment you host paying guests, and the platforms’ damage programs are not insurance; they’re goodwill programs with fine print. STR-specific policies on rural cabins with hot tubs and wood stoves commonly run $2,500–$6,000 a year. Get a bindable quote (one you could accept on the spot, not a website estimate) during due diligence.</w:t>
+        <w:t xml:space="preserve">Budget for a short-term-rental policy, not a homeowners policy. A homeowners policy typically voids your coverage the moment you host paying guests, and the platforms’ damage programs are not insurance; they’re goodwill programs with fine print. STR-specific policies on rural cabins with hot tubs and wood stoves commonly run $2,500–$6,000 a year. Get a real quote during due diligence: a firm number you could accept on the spot, not a website estimate.</w:t>
       </w:r>
     </w:p>
     <w:p>
@@ -11911,7 +11971,7 @@
         <w:pStyle w:val="Compact"/>
       </w:pPr>
       <w:r>
-        <w:t xml:space="preserve">STR insurance: a bindable STR-policy quote, not the homeowners number</w:t>
+        <w:t xml:space="preserve">STR insurance: a firm STR-policy quote, not the homeowners number</w:t>
       </w:r>
     </w:p>
     <w:p>
@@ -15111,7 +15171,25 @@
         <w:t xml:space="preserve">”</w:t>
       </w:r>
       <w:r>
-        <w:t xml:space="preserve">; filter Zillow for 90+ days on market; check Craigslist and Facebook Marketplace; go deeper with tools like BatchLeads or PropStream.</w:t>
+        <w:t xml:space="preserve">; filter Zillow for 90+ days on market; check Craigslist and Facebook Marketplace; go deeper with a dedicated lead-generation tool (search</w:t>
+      </w:r>
+      <w:r>
+        <w:t xml:space="preserve"> </w:t>
+      </w:r>
+      <w:r>
+        <w:t xml:space="preserve">“</w:t>
+      </w:r>
+      <w:r>
+        <w:t xml:space="preserve">real estate seller lead software</w:t>
+      </w:r>
+      <w:r>
+        <w:t xml:space="preserve">”</w:t>
+      </w:r>
+      <w:r>
+        <w:t xml:space="preserve"> </w:t>
+      </w:r>
+      <w:r>
+        <w:t xml:space="preserve">for the current options).</w:t>
       </w:r>
       <w:r>
         <w:t xml:space="preserve"> </w:t>
@@ -15215,7 +15293,7 @@
         <w:t xml:space="preserve"> </w:t>
       </w:r>
       <w:r>
-        <w:t xml:space="preserve">Best for covering the $20K–$40K+ furnishing and setup bill without draining your down payment. You get 6–18 months interest-free, which is breathing room to get listed and profitable before paying it down. The rule stands. If you put $30K on a 0% card, that $30K goes in your ROI calculation. It’s still real debt.</w:t>
+        <w:t xml:space="preserve">Best for covering a big slice of the furnishing and setup bill without draining your down payment. You get 6–18 months interest-free, which is breathing room to get listed and profitable before paying it down. The rule stands. If you put $30K on a 0% card, that $30K goes in your ROI calculation. It’s still real debt.</w:t>
       </w:r>
       <w:r>
         <w:t xml:space="preserve"> </w:t>
@@ -15901,6 +15979,14 @@
       </w:pPr>
       <w:r>
         <w:t xml:space="preserve">Stack those moves in that same two-bedroom cabin and watch the count climb. The two queens sleep four. Add a trundle and you’re at six. Make the sofa a pull-out and you’re at eight. Run the rule to check: 1,000 square feet minus 150 for the bath plans as 850, so eight or nine sleepers is right on target. If the rooms can take it, a queen-over-queen bunk pushes you to ten.</w:t>
+      </w:r>
+    </w:p>
+    <w:p>
+      <w:pPr>
+        <w:pStyle w:val="BodyText"/>
+      </w:pPr>
+      <w:r>
+        <w:t xml:space="preserve">I love the queen-over-queen hack, so let me push it to its ceiling — literally. If a room is genuinely big enough (a safe layout, a ceiling high enough for the top sleeper to sit up, no fan waiting at head height), two queen-over-queen bunks put eight people in a single room. Run single queen-over-queens across a 3-bedroom home and it sleeps twelve. Two cautions ride along. Keep one bunk-free bedroom, because some guests just don’t do ladders. And check your insurer’s rules and the local code before you build up: in Columbus, Georgia, we once had to pull a bunk out of a home because the ceiling height didn’t allow it. Measure first, then stack.</w:t>
       </w:r>
     </w:p>
     <w:p>

</xml_diff>